<commit_message>
docs: requirements docx — Q-H6 (Z-approach order) + implementation status refresh
Co-Authored-By: Claude Fable 5 <noreply@anthropic.com>
Claude-Session: https://claude.ai/code/session_015iWEURwXag7KpTURDC7RSz
</commit_message>
<xml_diff>
--- a/Docs/requirements/2PP_API_Platform_Requirements.docx
+++ b/Docs/requirements/2PP_API_Platform_Requirements.docx
@@ -70,7 +70,7 @@
                 <w:i/>
                 <w:sz w:val="19"/>
               </w:rPr>
-              <w:t>a first working version of the Milestone-1 platform ('</w:t>
+              <w:t>the Milestone-1 platform ('labgate') is implemented on branch feature/labgate-platform — 97 automated tests, fully runnable in simulation mode without hardware. Implemented: all four device adapters (camera/WL simulated pending SDK docs), validation, approval lifecycle, synchronized-exposure execution path, STL printing with server-side slicing, power-sweep/z-stack operations, toolpath preview images for the approver, audit log, MCP wrapper, and an end-to-end two-agent demo. The open questions in §7 gate the remaining work (camera/WL adapters, rig bring-up, chat platform integration).</w:t>
             </w:r>
             <w:proofErr w:type="spellStart"/>
             <w:r>
@@ -78,7 +78,6 @@
                 <w:i/>
                 <w:sz w:val="19"/>
               </w:rPr>
-              <w:t>labgate</w:t>
             </w:r>
             <w:proofErr w:type="spellEnd"/>
             <w:r>
@@ -86,7 +85,6 @@
                 <w:i/>
                 <w:sz w:val="19"/>
               </w:rPr>
-              <w:t>') exists on branch, fully runnable in simulation mode without hardware. The open questions in §7 gate the remaining work (camera/WL adapters, rig bring-up, chat platform integration).</w:t>
             </w:r>
           </w:p>
         </w:tc>
@@ -1635,6 +1633,53 @@
           <w:p/>
         </w:tc>
       </w:tr>
+      <w:tr>
+        <w:tc>
+          <w:tcPr>
+            <w:tcW w:type="dxa" w:w="864"/>
+            <w:shd w:val="clear" w:fill="F2F5FA"/>
+          </w:tcPr>
+          <w:p>
+            <w:r/>
+            <w:r>
+              <w:rPr>
+                <w:b/>
+                <w:sz w:val="19"/>
+              </w:rPr>
+              <w:t>Q-H6</w:t>
+            </w:r>
+          </w:p>
+        </w:tc>
+        <w:tc>
+          <w:tcPr>
+            <w:tcW w:type="dxa" w:w="6624"/>
+            <w:shd w:val="clear" w:fill="F2F5FA"/>
+          </w:tcPr>
+          <w:p>
+            <w:r/>
+            <w:r>
+              <w:rPr>
+                <w:sz w:val="19"/>
+              </w:rPr>
+              <w:t>Safe Z/focal-plane approach: is a 3-axis diagonal move to the focus position acceptable, or must the approach be sequenced (XY first then Z, or Z-first)? Any objective-collision risk? Should the park position stay [0,0,0]?</w:t>
+            </w:r>
+          </w:p>
+        </w:tc>
+        <w:tc>
+          <w:tcPr>
+            <w:tcW w:type="dxa" w:w="2592"/>
+            <w:shd w:val="clear" w:fill="F2F5FA"/>
+          </w:tcPr>
+          <w:p>
+            <w:r/>
+            <w:r>
+              <w:rPr>
+                <w:sz w:val="19"/>
+              </w:rPr>
+            </w:r>
+          </w:p>
+        </w:tc>
+      </w:tr>
     </w:tbl>
     <w:p>
       <w:pPr>

</xml_diff>